<commit_message>
add photo, chatbot knowledge, resume
</commit_message>
<xml_diff>
--- a/public/documents/Frunco_Ruiz_CV.docx
+++ b/public/documents/Frunco_Ruiz_CV.docx
@@ -4,316 +4,539 @@
   <w:body>
     <w:p>
       <w:pPr>
+        <w:spacing w:after="20"/>
         <w:jc w:val="center"/>
       </w:pPr>
       <w:r>
         <w:rPr>
+          <w:rFonts w:ascii="Aptos Display" w:hAnsi="Aptos Display"/>
           <w:b/>
-          <w:sz w:val="40"/>
+          <w:sz w:val="44"/>
         </w:rPr>
         <w:t>FRUNCO RUIZ</w:t>
       </w:r>
     </w:p>
     <w:p>
       <w:pPr>
+        <w:spacing w:after="40"/>
         <w:jc w:val="center"/>
       </w:pPr>
       <w:r>
         <w:rPr>
+          <w:rFonts w:ascii="Aptos" w:hAnsi="Aptos"/>
           <w:b/>
-          <w:sz w:val="22"/>
+          <w:sz w:val="20"/>
         </w:rPr>
-        <w:t>FULL-STACK DEVELOPER</w:t>
+        <w:t>FULL-STACK DEVELOPER &amp; AI PRODUCT BUILDER</w:t>
       </w:r>
     </w:p>
     <w:p>
       <w:pPr>
+        <w:spacing w:after="160"/>
         <w:jc w:val="center"/>
       </w:pPr>
       <w:r>
         <w:rPr>
-          <w:sz w:val="17"/>
+          <w:rFonts w:ascii="Aptos" w:hAnsi="Aptos"/>
+          <w:sz w:val="16"/>
         </w:rPr>
-        <w:t>Los Angeles, California, USA  |  [Email]  |  [Phone]  |  [Portfolio]  |  [GitHub]  |  [LinkedIn]</w:t>
+        <w:t>Los Angeles, California, USA  •  azulrio906top@gmail.com  •  my-portfolio-seven-one.vercel.app  •  github.com/joanacristovao8511-debug</w:t>
       </w:r>
     </w:p>
     <w:p>
       <w:pPr>
-        <w:pStyle w:val="Heading1"/>
+        <w:spacing w:before="160" w:after="80"/>
       </w:pPr>
       <w:r>
-        <w:t>PROFILE</w:t>
-      </w:r>
-    </w:p>
-    <w:p>
-      <w:r>
-        <w:t>Full-Stack Developer with a strong interest in modern web technologies, AI-assisted development, interactive user interfaces, and database-driven applications. Enjoys building applications from the frontend through the backend, including UI development, APIs, authentication, database architecture, and deployment-oriented tooling.</w:t>
+        <w:rPr>
+          <w:rFonts w:ascii="Aptos" w:hAnsi="Aptos"/>
+          <w:b/>
+          <w:sz w:val="22"/>
+        </w:rPr>
+        <w:t>PROFESSIONAL SUMMARY</w:t>
       </w:r>
     </w:p>
     <w:p>
       <w:pPr>
-        <w:pStyle w:val="Heading1"/>
+        <w:spacing w:after="80"/>
       </w:pPr>
       <w:r>
-        <w:t>CORE TECHNOLOGIES</w:t>
-      </w:r>
-    </w:p>
-    <w:p>
-      <w:r>
-        <w:t>React • Next.js • TypeScript • JavaScript • Tailwind CSS • Node.js • PostgreSQL • Prisma • Zustand • Framer Motion • REST APIs • NextAuth / Authentication • Docker • Git / GitHub • AI-assisted development • AI chatbot integration</w:t>
+        <w:t>Full-stack developer and product builder creating polished web applications, business platforms and AI-powered experiences. Builds end-to-end systems spanning frontend architecture, backend services, APIs, databases, authentication, AI/LLM integrations and product-focused UX, with an emphasis on usability, performance, maintainability and real business value.</w:t>
       </w:r>
     </w:p>
     <w:p>
       <w:pPr>
-        <w:pStyle w:val="Heading1"/>
+        <w:spacing w:before="160" w:after="80"/>
       </w:pPr>
       <w:r>
-        <w:t>PROFESSIONAL &amp; TECHNICAL EXPERIENCE</w:t>
+        <w:rPr>
+          <w:rFonts w:ascii="Aptos" w:hAnsi="Aptos"/>
+          <w:b/>
+          <w:sz w:val="22"/>
+        </w:rPr>
+        <w:t>TECHNICAL SKILLS</w:t>
       </w:r>
     </w:p>
     <w:p>
       <w:pPr>
-        <w:pStyle w:val="Heading2"/>
+        <w:spacing w:after="20"/>
       </w:pPr>
       <w:r>
-        <w:t>Full-Stack Web Development</w:t>
+        <w:rPr>
+          <w:b/>
+          <w:sz w:val="18"/>
+        </w:rPr>
+        <w:t xml:space="preserve">Frontend: </w:t>
+      </w:r>
+      <w:r>
+        <w:rPr>
+          <w:sz w:val="18"/>
+        </w:rPr>
+        <w:t>React, Next.js, TypeScript, JavaScript, Tailwind CSS, Zustand, HTML5, CSS3</w:t>
       </w:r>
     </w:p>
     <w:p>
+      <w:pPr>
+        <w:spacing w:after="20"/>
+      </w:pPr>
       <w:r>
-        <w:t>Develop and experiment with modern full-stack web applications using React and Next.js on the frontend and Node.js/PostgreSQL-based technologies on the backend.</w:t>
+        <w:rPr>
+          <w:b/>
+          <w:sz w:val="18"/>
+        </w:rPr>
+        <w:t xml:space="preserve">Backend: </w:t>
+      </w:r>
+      <w:r>
+        <w:rPr>
+          <w:sz w:val="18"/>
+        </w:rPr>
+        <w:t>Node.js, Express, REST APIs, Authentication, NextAuth</w:t>
+      </w:r>
+    </w:p>
+    <w:p>
+      <w:pPr>
+        <w:spacing w:after="20"/>
+      </w:pPr>
+      <w:r>
+        <w:rPr>
+          <w:b/>
+          <w:sz w:val="18"/>
+        </w:rPr>
+        <w:t xml:space="preserve">Database: </w:t>
+      </w:r>
+      <w:r>
+        <w:rPr>
+          <w:sz w:val="18"/>
+        </w:rPr>
+        <w:t>PostgreSQL, SQLite, MongoDB, Prisma, Redis</w:t>
+      </w:r>
+    </w:p>
+    <w:p>
+      <w:pPr>
+        <w:spacing w:after="20"/>
+      </w:pPr>
+      <w:r>
+        <w:rPr>
+          <w:b/>
+          <w:sz w:val="18"/>
+        </w:rPr>
+        <w:t xml:space="preserve">AI &amp; Automation: </w:t>
+      </w:r>
+      <w:r>
+        <w:rPr>
+          <w:sz w:val="18"/>
+        </w:rPr>
+        <w:t>Generative AI, RAG, AI Agents, AI Integration, AI Assistants, OpenAI, LLM Integration, AI Automation</w:t>
+      </w:r>
+    </w:p>
+    <w:p>
+      <w:pPr>
+        <w:spacing w:after="20"/>
+      </w:pPr>
+      <w:r>
+        <w:rPr>
+          <w:b/>
+          <w:sz w:val="18"/>
+        </w:rPr>
+        <w:t xml:space="preserve">DevOps: </w:t>
+      </w:r>
+      <w:r>
+        <w:rPr>
+          <w:sz w:val="18"/>
+        </w:rPr>
+        <w:t>Git, GitHub, Docker, Vitest</w:t>
+      </w:r>
+    </w:p>
+    <w:p>
+      <w:pPr>
+        <w:spacing w:before="160" w:after="80"/>
+      </w:pPr>
+      <w:r>
+        <w:rPr>
+          <w:rFonts w:ascii="Aptos" w:hAnsi="Aptos"/>
+          <w:b/>
+          <w:sz w:val="22"/>
+        </w:rPr>
+        <w:t>PROFESSIONAL EXPERIENCE</w:t>
+      </w:r>
+    </w:p>
+    <w:p>
+      <w:pPr>
+        <w:spacing w:after="0"/>
+      </w:pPr>
+      <w:r>
+        <w:rPr>
+          <w:b/>
+          <w:sz w:val="20"/>
+        </w:rPr>
+        <w:t>Full-Stack Developer &amp; AI Product Engineer</w:t>
+      </w:r>
+      <w:r>
+        <w:rPr>
+          <w:i/>
+        </w:rPr>
+        <w:t xml:space="preserve">  |  May 2023 — Present</w:t>
+      </w:r>
+    </w:p>
+    <w:p>
+      <w:pPr>
+        <w:spacing w:after="20"/>
+      </w:pPr>
+      <w:r>
+        <w:rPr>
+          <w:b/>
+          <w:sz w:val="17"/>
+        </w:rPr>
+        <w:t>Independent / Freelance · Remote</w:t>
+      </w:r>
+    </w:p>
+    <w:p>
+      <w:pPr>
+        <w:spacing w:after="80"/>
+      </w:pPr>
+      <w:r>
+        <w:t>Lead end-to-end development of AI-powered applications and modern web platforms across frontend architecture, backend services, API design, database systems, authentication and AI/LLM integrations. Build scalable product foundations, intelligent workflows and polished user experiences from prototype to production.</w:t>
+      </w:r>
+    </w:p>
+    <w:p>
+      <w:pPr>
+        <w:spacing w:after="0"/>
+      </w:pPr>
+      <w:r>
+        <w:rPr>
+          <w:b/>
+          <w:sz w:val="20"/>
+        </w:rPr>
+        <w:t>Senior Full-Stack Developer</w:t>
+      </w:r>
+      <w:r>
+        <w:rPr>
+          <w:i/>
+        </w:rPr>
+        <w:t xml:space="preserve">  |  Jan 2021 — Apr 2022</w:t>
+      </w:r>
+    </w:p>
+    <w:p>
+      <w:pPr>
+        <w:spacing w:after="20"/>
+      </w:pPr>
+      <w:r>
+        <w:rPr>
+          <w:b/>
+          <w:sz w:val="17"/>
+        </w:rPr>
+        <w:t>Product Development · Remote</w:t>
+      </w:r>
+    </w:p>
+    <w:p>
+      <w:pPr>
+        <w:spacing w:after="80"/>
+      </w:pPr>
+      <w:r>
+        <w:t>Led development of modern web platforms and internal business applications across frontend and backend systems. Built reusable component architectures, REST APIs, database-driven workflows, authentication systems and responsive interfaces while working closely with product and design requirements.</w:t>
+      </w:r>
+    </w:p>
+    <w:p>
+      <w:pPr>
+        <w:spacing w:after="0"/>
+      </w:pPr>
+      <w:r>
+        <w:rPr>
+          <w:b/>
+          <w:sz w:val="20"/>
+        </w:rPr>
+        <w:t>Frontend Developer</w:t>
+      </w:r>
+      <w:r>
+        <w:rPr>
+          <w:i/>
+        </w:rPr>
+        <w:t xml:space="preserve">  |  Jan 2019 — Dec 2020</w:t>
+      </w:r>
+    </w:p>
+    <w:p>
+      <w:pPr>
+        <w:spacing w:after="20"/>
+      </w:pPr>
+      <w:r>
+        <w:rPr>
+          <w:b/>
+          <w:sz w:val="17"/>
+        </w:rPr>
+        <w:t>Software Development · Remote</w:t>
+      </w:r>
+    </w:p>
+    <w:p>
+      <w:pPr>
+        <w:spacing w:after="80"/>
+      </w:pPr>
+      <w:r>
+        <w:t>Developed production-grade responsive interfaces using modern JavaScript frameworks and component-based architectures. Focused on reusable UI systems, performance, accessibility, responsive design and translating product requirements into polished user experiences.</w:t>
+      </w:r>
+    </w:p>
+    <w:p>
+      <w:pPr>
+        <w:spacing w:before="160" w:after="80"/>
+      </w:pPr>
+      <w:r>
+        <w:rPr>
+          <w:rFonts w:ascii="Aptos" w:hAnsi="Aptos"/>
+          <w:b/>
+          <w:sz w:val="22"/>
+        </w:rPr>
+        <w:t>SELECTED PROJECTS</w:t>
+      </w:r>
+    </w:p>
+    <w:p>
+      <w:pPr>
+        <w:spacing w:after="0"/>
+      </w:pPr>
+      <w:r>
+        <w:rPr>
+          <w:b/>
+          <w:sz w:val="19"/>
+        </w:rPr>
+        <w:t>AI Workflow Automation</w:t>
+      </w:r>
+      <w:r>
+        <w:rPr>
+          <w:i/>
+        </w:rPr>
+        <w:t xml:space="preserve">  |  AI, Automation, Node.js, APIs, TypeScript</w:t>
+      </w:r>
+    </w:p>
+    <w:p>
+      <w:pPr>
+        <w:spacing w:after="60"/>
+      </w:pPr>
+      <w:r>
+        <w:t>Automation system combining AI capabilities with structured business workflows to reduce repetitive manual tasks.</w:t>
+      </w:r>
+    </w:p>
+    <w:p>
+      <w:pPr>
+        <w:spacing w:after="0"/>
+      </w:pPr>
+      <w:r>
+        <w:rPr>
+          <w:b/>
+          <w:sz w:val="19"/>
+        </w:rPr>
+        <w:t>Retrieval-Augmented Generation</w:t>
+      </w:r>
+      <w:r>
+        <w:rPr>
+          <w:i/>
+        </w:rPr>
+        <w:t xml:space="preserve">  |  Next.js, React, TypeScript, Tailwind CSS, RAG</w:t>
+      </w:r>
+    </w:p>
+    <w:p>
+      <w:pPr>
+        <w:spacing w:after="60"/>
+      </w:pPr>
+      <w:r>
+        <w:t>Production-ready RAG system focused on grounding AI responses with relevant source context and a production-minded architecture.</w:t>
+      </w:r>
+    </w:p>
+    <w:p>
+      <w:pPr>
+        <w:spacing w:after="0"/>
+      </w:pPr>
+      <w:r>
+        <w:rPr>
+          <w:b/>
+          <w:sz w:val="19"/>
+        </w:rPr>
+        <w:t>Developer Portfolio CMS</w:t>
+      </w:r>
+      <w:r>
+        <w:rPr>
+          <w:i/>
+        </w:rPr>
+        <w:t xml:space="preserve">  |  Next.js, Prisma, PostgreSQL, OpenAI, Vercel</w:t>
+      </w:r>
+    </w:p>
+    <w:p>
+      <w:pPr>
+        <w:spacing w:after="60"/>
+      </w:pPr>
+      <w:r>
+        <w:t>Content-driven developer portfolio with project management, skills, experience and an authenticated admin dashboard.</w:t>
+      </w:r>
+    </w:p>
+    <w:p>
+      <w:pPr>
+        <w:spacing w:after="0"/>
+      </w:pPr>
+      <w:r>
+        <w:rPr>
+          <w:b/>
+          <w:sz w:val="19"/>
+        </w:rPr>
+        <w:t>Business Management Platform</w:t>
+      </w:r>
+      <w:r>
+        <w:rPr>
+          <w:i/>
+        </w:rPr>
+        <w:t xml:space="preserve">  |  Next.js, TailwindCSS, Vercel</w:t>
+      </w:r>
+    </w:p>
+    <w:p>
+      <w:pPr>
+        <w:spacing w:after="60"/>
+      </w:pPr>
+      <w:r>
+        <w:t>Full-stack business application for customers, workflows, records and day-to-day operations.</w:t>
+      </w:r>
+    </w:p>
+    <w:p>
+      <w:pPr>
+        <w:spacing w:before="160" w:after="80"/>
+      </w:pPr>
+      <w:r>
+        <w:rPr>
+          <w:rFonts w:ascii="Aptos" w:hAnsi="Aptos"/>
+          <w:b/>
+          <w:sz w:val="22"/>
+        </w:rPr>
+        <w:t>EDUCATION</w:t>
+      </w:r>
+    </w:p>
+    <w:p>
+      <w:pPr>
+        <w:spacing w:after="40"/>
+      </w:pPr>
+      <w:r>
+        <w:rPr>
+          <w:b/>
+        </w:rPr>
+        <w:t>Vietnam National University, Hanoi</w:t>
+      </w:r>
+      <w:r>
+        <w:t xml:space="preserve">  |  Bachelor's degree in Computer Science</w:t>
+      </w:r>
+    </w:p>
+    <w:p>
+      <w:pPr>
+        <w:spacing w:before="160" w:after="80"/>
+      </w:pPr>
+      <w:r>
+        <w:rPr>
+          <w:rFonts w:ascii="Aptos" w:hAnsi="Aptos"/>
+          <w:b/>
+          <w:sz w:val="22"/>
+        </w:rPr>
+        <w:t>WORKING APPROACH</w:t>
       </w:r>
     </w:p>
     <w:p>
       <w:pPr>
         <w:pStyle w:val="ListBullet"/>
         <w:spacing w:after="20"/>
+        <w:ind w:left="259" w:hanging="173"/>
       </w:pPr>
       <w:r>
-        <w:t>Interface design and implementation</w:t>
+        <w:rPr>
+          <w:rFonts w:ascii="Aptos" w:hAnsi="Aptos"/>
+          <w:sz w:val="18"/>
+        </w:rPr>
+        <w:t>Business first — understand the goal before choosing the technology.</w:t>
       </w:r>
     </w:p>
     <w:p>
       <w:pPr>
         <w:pStyle w:val="ListBullet"/>
         <w:spacing w:after="20"/>
+        <w:ind w:left="259" w:hanging="173"/>
       </w:pPr>
       <w:r>
-        <w:t>Reusable React components and responsive layouts</w:t>
+        <w:rPr>
+          <w:rFonts w:ascii="Aptos" w:hAnsi="Aptos"/>
+          <w:sz w:val="18"/>
+        </w:rPr>
+        <w:t>Clean engineering — build software that is reliable, maintainable and ready to grow.</w:t>
       </w:r>
     </w:p>
     <w:p>
       <w:pPr>
         <w:pStyle w:val="ListBullet"/>
         <w:spacing w:after="20"/>
+        <w:ind w:left="259" w:hanging="173"/>
       </w:pPr>
       <w:r>
-        <w:t>Client and server-side functionality</w:t>
+        <w:rPr>
+          <w:rFonts w:ascii="Aptos" w:hAnsi="Aptos"/>
+          <w:sz w:val="18"/>
+        </w:rPr>
+        <w:t>Long-term thinking — create systems that continue working after launch.</w:t>
+      </w:r>
+    </w:p>
+    <w:p>
+      <w:pPr>
+        <w:spacing w:before="160" w:after="80"/>
+      </w:pPr>
+      <w:r>
+        <w:rPr>
+          <w:rFonts w:ascii="Aptos" w:hAnsi="Aptos"/>
+          <w:b/>
+          <w:sz w:val="22"/>
+        </w:rPr>
+        <w:t>CURRENT FOCUS</w:t>
       </w:r>
     </w:p>
     <w:p>
       <w:pPr>
         <w:pStyle w:val="ListBullet"/>
         <w:spacing w:after="20"/>
+        <w:ind w:left="259" w:hanging="173"/>
       </w:pPr>
       <w:r>
-        <w:t>REST API development and authentication</w:t>
+        <w:rPr>
+          <w:rFonts w:ascii="Aptos" w:hAnsi="Aptos"/>
+          <w:sz w:val="18"/>
+        </w:rPr>
+        <w:t>AI agent architectures, Retrieval-Augmented Generation (RAG), LLM application design, cloud infrastructure and scalable full-stack systems.</w:t>
       </w:r>
     </w:p>
     <w:p>
       <w:pPr>
         <w:pStyle w:val="ListBullet"/>
         <w:spacing w:after="20"/>
+        <w:ind w:left="259" w:hanging="173"/>
       </w:pPr>
       <w:r>
-        <w:t>Database modeling, Prisma integration, migrations, and seeding</w:t>
-      </w:r>
-    </w:p>
-    <w:p>
-      <w:pPr>
-        <w:pStyle w:val="ListBullet"/>
-        <w:spacing w:after="20"/>
-      </w:pPr>
-      <w:r>
-        <w:t>CRUD operations and testing</w:t>
-      </w:r>
-    </w:p>
-    <w:p>
-      <w:pPr>
-        <w:pStyle w:val="ListBullet"/>
-        <w:spacing w:after="20"/>
-      </w:pPr>
-      <w:r>
-        <w:t>Docker-based development and Git-based source control</w:t>
-      </w:r>
-    </w:p>
-    <w:p>
-      <w:pPr>
-        <w:pStyle w:val="Heading2"/>
-      </w:pPr>
-      <w:r>
-        <w:t>AI-Assisted Development</w:t>
-      </w:r>
-    </w:p>
-    <w:p>
-      <w:r>
-        <w:t>Explore AI tools as part of the software development workflow, including AI coding assistants, conversational interfaces, AI chatbots, and connecting AI systems with application data.</w:t>
-      </w:r>
-    </w:p>
-    <w:p>
-      <w:pPr>
-        <w:pStyle w:val="Heading1"/>
-      </w:pPr>
-      <w:r>
-        <w:t>SELECTED PROJECT</w:t>
-      </w:r>
-    </w:p>
-    <w:p>
-      <w:pPr>
-        <w:pStyle w:val="Heading2"/>
-      </w:pPr>
-      <w:r>
-        <w:t>AI-Powered Developer Portfolio</w:t>
-      </w:r>
-    </w:p>
-    <w:p>
-      <w:r>
-        <w:t>A modern personal portfolio combining professional presentation with interactive technology.</w:t>
-      </w:r>
-    </w:p>
-    <w:p>
-      <w:r>
-        <w:t>Technology: Next.js, React, TypeScript, Tailwind CSS, Node.js, PostgreSQL, Prisma, Zustand, Framer Motion</w:t>
-      </w:r>
-    </w:p>
-    <w:p>
-      <w:pPr>
-        <w:pStyle w:val="ListBullet"/>
-        <w:spacing w:after="20"/>
-      </w:pPr>
-      <w:r>
-        <w:t>Personal profile, skills, projects, and experience management</w:t>
-      </w:r>
-    </w:p>
-    <w:p>
-      <w:pPr>
-        <w:pStyle w:val="ListBullet"/>
-        <w:spacing w:after="20"/>
-      </w:pPr>
-      <w:r>
-        <w:t>Administrative dashboard with authentication and CRUD operations</w:t>
-      </w:r>
-    </w:p>
-    <w:p>
-      <w:pPr>
-        <w:pStyle w:val="ListBullet"/>
-        <w:spacing w:after="20"/>
-      </w:pPr>
-      <w:r>
-        <w:t>PostgreSQL database with Prisma ORM</w:t>
-      </w:r>
-    </w:p>
-    <w:p>
-      <w:pPr>
-        <w:pStyle w:val="ListBullet"/>
-        <w:spacing w:after="20"/>
-      </w:pPr>
-      <w:r>
-        <w:t>AI-powered portfolio chatbot</w:t>
-      </w:r>
-    </w:p>
-    <w:p>
-      <w:pPr>
-        <w:pStyle w:val="ListBullet"/>
-        <w:spacing w:after="20"/>
-      </w:pPr>
-      <w:r>
-        <w:t>Responsive design, interactive animations, and dark/light interface support</w:t>
-      </w:r>
-    </w:p>
-    <w:p>
-      <w:pPr>
-        <w:pStyle w:val="ListBullet"/>
-        <w:spacing w:after="20"/>
-      </w:pPr>
-      <w:r>
-        <w:t>Project imagery and external project links</w:t>
-      </w:r>
-    </w:p>
-    <w:p>
-      <w:pPr>
-        <w:pStyle w:val="Heading1"/>
-      </w:pPr>
-      <w:r>
-        <w:t>DEVELOPMENT PHILOSOPHY</w:t>
-      </w:r>
-    </w:p>
-    <w:p>
-      <w:r>
-        <w:t>I enjoy learning by building, experimenting with new technologies, and continuously improving existing work. My approach emphasizes clean architecture, practical solutions, attractive interfaces, maintainable code, and useful user experiences.</w:t>
-      </w:r>
-    </w:p>
-    <w:p>
-      <w:pPr>
-        <w:pStyle w:val="Heading1"/>
-      </w:pPr>
-      <w:r>
-        <w:t>EDUCATION</w:t>
-      </w:r>
-    </w:p>
-    <w:p>
-      <w:r>
-        <w:t>[Degree / Program] — [School / University], [Year]</w:t>
-      </w:r>
-    </w:p>
-    <w:p>
-      <w:pPr>
-        <w:pStyle w:val="Heading1"/>
-      </w:pPr>
-      <w:r>
-        <w:t>CERTIFICATIONS &amp; TRAINING</w:t>
-      </w:r>
-    </w:p>
-    <w:p>
-      <w:r>
-        <w:t>[Add certifications, courses, or training]</w:t>
-      </w:r>
-    </w:p>
-    <w:p>
-      <w:pPr>
-        <w:pStyle w:val="Heading1"/>
-      </w:pPr>
-      <w:r>
-        <w:t>ADDITIONAL INFORMATION</w:t>
-      </w:r>
-    </w:p>
-    <w:p>
-      <w:r>
-        <w:t>Languages: [Add languages]</w:t>
-        <w:br/>
-        <w:t>Interests: Web development • Artificial intelligence • UI/UX • Software engineering • Technology • Creative digital projects</w:t>
-      </w:r>
-    </w:p>
-    <w:p>
-      <w:pPr>
-        <w:pStyle w:val="Heading1"/>
-      </w:pPr>
-      <w:r>
-        <w:t>ONLINE</w:t>
-      </w:r>
-    </w:p>
-    <w:p>
-      <w:r>
-        <w:t>Portfolio: [URL]</w:t>
-        <w:br/>
-        <w:t>GitHub: [URL]</w:t>
-        <w:br/>
-        <w:t>LinkedIn: [URL]</w:t>
+        <w:rPr>
+          <w:rFonts w:ascii="Aptos" w:hAnsi="Aptos"/>
+          <w:sz w:val="18"/>
+        </w:rPr>
+        <w:t>Currently learning: advanced AI workflows, agent orchestration, system design and distributed applications.</w:t>
       </w:r>
     </w:p>
     <w:sectPr>
       <w:pgSz w:w="12240" w:h="15840"/>
-      <w:pgMar w:top="792" w:right="1008" w:bottom="792" w:left="1008" w:header="720" w:footer="720" w:gutter="0"/>
+      <w:pgMar w:top="792" w:right="936" w:bottom="792" w:left="936" w:header="720" w:footer="720" w:gutter="0"/>
       <w:cols w:space="720"/>
       <w:docGrid w:linePitch="360"/>
     </w:sectPr>
@@ -686,7 +909,7 @@
     <w:rsid w:val="00FC693F"/>
     <w:rPr>
       <w:rFonts w:ascii="Aptos" w:hAnsi="Aptos"/>
-      <w:sz w:val="19"/>
+      <w:sz w:val="18"/>
     </w:rPr>
   </w:style>
   <w:style w:type="paragraph" w:styleId="Header">
@@ -748,11 +971,11 @@
       <w:outlineLvl w:val="0"/>
     </w:pPr>
     <w:rPr>
-      <w:rFonts w:asciiTheme="majorHAnsi" w:eastAsiaTheme="majorEastAsia" w:hAnsiTheme="majorHAnsi" w:cstheme="majorBidi" w:ascii="Aptos" w:hAnsi="Aptos"/>
+      <w:rFonts w:asciiTheme="majorHAnsi" w:eastAsiaTheme="majorEastAsia" w:hAnsiTheme="majorHAnsi" w:cstheme="majorBidi"/>
       <w:b/>
       <w:bCs/>
       <w:color w:val="365F91" w:themeColor="accent1" w:themeShade="BF"/>
-      <w:sz w:val="24"/>
+      <w:sz w:val="28"/>
       <w:szCs w:val="28"/>
     </w:rPr>
   </w:style>
@@ -772,11 +995,11 @@
       <w:outlineLvl w:val="1"/>
     </w:pPr>
     <w:rPr>
-      <w:rFonts w:asciiTheme="majorHAnsi" w:eastAsiaTheme="majorEastAsia" w:hAnsiTheme="majorHAnsi" w:cstheme="majorBidi" w:ascii="Aptos" w:hAnsi="Aptos"/>
+      <w:rFonts w:asciiTheme="majorHAnsi" w:eastAsiaTheme="majorEastAsia" w:hAnsiTheme="majorHAnsi" w:cstheme="majorBidi"/>
       <w:b/>
       <w:bCs/>
       <w:color w:val="4F81BD" w:themeColor="accent1"/>
-      <w:sz w:val="21"/>
+      <w:sz w:val="26"/>
       <w:szCs w:val="26"/>
     </w:rPr>
   </w:style>
@@ -1037,11 +1260,11 @@
       <w:contextualSpacing/>
     </w:pPr>
     <w:rPr>
-      <w:rFonts w:asciiTheme="majorHAnsi" w:eastAsiaTheme="majorEastAsia" w:hAnsiTheme="majorHAnsi" w:cstheme="majorBidi" w:ascii="Aptos" w:hAnsi="Aptos"/>
+      <w:rFonts w:asciiTheme="majorHAnsi" w:eastAsiaTheme="majorEastAsia" w:hAnsiTheme="majorHAnsi" w:cstheme="majorBidi"/>
       <w:color w:val="17365D" w:themeColor="text2" w:themeShade="BF"/>
       <w:spacing w:val="5"/>
       <w:kern w:val="28"/>
-      <w:sz w:val="40"/>
+      <w:sz w:val="52"/>
       <w:szCs w:val="52"/>
     </w:rPr>
   </w:style>

</xml_diff>